<commit_message>
Cracion de las tablas de base de datos con usando Room, creacion de pantalla de login, registro y pantalla princiapal, done la pantalla princial es solo de ejemplo y se ira modificando
</commit_message>
<xml_diff>
--- a/Documentación/Documentación.docx
+++ b/Documentación/Documentación.docx
@@ -99,15 +99,7 @@
         <w:jc w:val="center"/>
       </w:pPr>
       <w:r>
-        <w:t xml:space="preserve">Repositorio de </w:t>
-      </w:r>
-      <w:proofErr w:type="spellStart"/>
-      <w:r>
-        <w:t>Github</w:t>
-      </w:r>
-      <w:proofErr w:type="spellEnd"/>
-      <w:r>
-        <w:t>:</w:t>
+        <w:t>Repositorio de Github:</w:t>
       </w:r>
       <w:r>
         <w:t xml:space="preserve"> </w:t>
@@ -874,23 +866,7 @@
         <w:t>La app a realizar para dispositivos Android, es una app, para que un usuario pueda crear rutinas de entrenamiento pudiendo añadir los ejercicios que existe, para poder mantener un control del entreno respecto a sesiones.</w:t>
       </w:r>
       <w:r>
-        <w:t xml:space="preserve"> Al ser una app para la </w:t>
-      </w:r>
-      <w:proofErr w:type="spellStart"/>
-      <w:r>
-        <w:t>practica</w:t>
-      </w:r>
-      <w:proofErr w:type="spellEnd"/>
-      <w:r>
-        <w:t xml:space="preserve"> usare un nombre genérico, siendo </w:t>
-      </w:r>
-      <w:proofErr w:type="spellStart"/>
-      <w:r>
-        <w:t>AppGym</w:t>
-      </w:r>
-      <w:proofErr w:type="spellEnd"/>
-      <w:r>
-        <w:t>.</w:t>
+        <w:t xml:space="preserve"> Al ser una app para la practica usare un nombre genérico, siendo AppGym.</w:t>
       </w:r>
     </w:p>
     <w:p>
@@ -957,7 +933,13 @@
         <w:jc w:val="both"/>
       </w:pPr>
       <w:r>
-        <w:t xml:space="preserve">Equilibrio entre Cobertura y Funcionalidad: La API 26 garantiza la compatibilidad con más del 90% de los dispositivos Android </w:t>
+        <w:t xml:space="preserve">Equilibrio entre Cobertura y Funcionalidad: La API 26 garantiza la compatibilidad con </w:t>
+      </w:r>
+      <w:r>
+        <w:t>el 98</w:t>
+      </w:r>
+      <w:r>
+        <w:t xml:space="preserve">% de los dispositivos Android </w:t>
       </w:r>
       <w:r>
         <w:t>del mercado</w:t>
@@ -982,42 +964,13 @@
         <w:jc w:val="both"/>
       </w:pPr>
       <w:r>
-        <w:t xml:space="preserve">Compatibilidad con Librerías Modernas: Permite el uso fluido de las librerías del ecosistema Android </w:t>
-      </w:r>
-      <w:proofErr w:type="spellStart"/>
-      <w:r>
-        <w:t>Jetpack</w:t>
-      </w:r>
-      <w:proofErr w:type="spellEnd"/>
-      <w:r>
-        <w:t xml:space="preserve">, tales como Room </w:t>
-      </w:r>
-      <w:proofErr w:type="spellStart"/>
-      <w:r>
-        <w:t>Database</w:t>
-      </w:r>
-      <w:proofErr w:type="spellEnd"/>
+        <w:t>Compatibilidad con Librerías Modernas: Permite el uso fluido de las librerías del ecosistema Android Jetpack, tales como Room Database</w:t>
+      </w:r>
       <w:r>
         <w:t xml:space="preserve"> </w:t>
       </w:r>
       <w:r>
-        <w:t xml:space="preserve">y </w:t>
-      </w:r>
-      <w:proofErr w:type="spellStart"/>
-      <w:r>
-        <w:t>Navigation</w:t>
-      </w:r>
-      <w:proofErr w:type="spellEnd"/>
-      <w:r>
-        <w:t xml:space="preserve"> </w:t>
-      </w:r>
-      <w:proofErr w:type="spellStart"/>
-      <w:r>
-        <w:t>Component</w:t>
-      </w:r>
-      <w:proofErr w:type="spellEnd"/>
-      <w:r>
-        <w:t>, evitando dependencias obsoletas o parches de retrocompatibilidad.</w:t>
+        <w:t>y Navigation Component, evitando dependencias obsoletas o parches de retrocompatibilidad.</w:t>
       </w:r>
     </w:p>
     <w:p>
@@ -1117,13 +1070,244 @@
       <w:r>
         <w:t xml:space="preserve">Para realizar al base de datos se utiliza </w:t>
       </w:r>
-      <w:proofErr w:type="spellStart"/>
-      <w:r>
-        <w:t>Firebase</w:t>
-      </w:r>
-      <w:proofErr w:type="spellEnd"/>
-      <w:r>
-        <w:t>, debido a que es en la nube, y la app esta hecha para que más usuarios puedan ver tus entrenos en el gimnasio.</w:t>
+      <w:r>
+        <w:t>Room</w:t>
+      </w:r>
+      <w:r>
+        <w:t xml:space="preserve">, </w:t>
+      </w:r>
+      <w:r>
+        <w:t>propuesto por el profesor</w:t>
+      </w:r>
+      <w:r>
+        <w:t>.</w:t>
+      </w:r>
+    </w:p>
+    <w:p>
+      <w:pPr>
+        <w:jc w:val="both"/>
+      </w:pPr>
+      <w:r>
+        <w:t>La base de datos consta de</w:t>
+      </w:r>
+      <w:r>
+        <w:t xml:space="preserve"> las siguientes tablas: </w:t>
+      </w:r>
+      <w:r>
+        <w:t>usuarios</w:t>
+      </w:r>
+      <w:r>
+        <w:t xml:space="preserve">, </w:t>
+      </w:r>
+      <w:r>
+        <w:t>rutinas</w:t>
+      </w:r>
+      <w:r>
+        <w:t xml:space="preserve">, </w:t>
+      </w:r>
+      <w:r>
+        <w:t>ejercicios</w:t>
+      </w:r>
+      <w:r>
+        <w:t xml:space="preserve">, </w:t>
+      </w:r>
+      <w:r>
+        <w:t>rutina_ejercicio</w:t>
+      </w:r>
+      <w:r>
+        <w:t xml:space="preserve">, </w:t>
+      </w:r>
+      <w:r>
+        <w:t>rutina_ejercicio</w:t>
+      </w:r>
+    </w:p>
+    <w:p>
+      <w:pPr>
+        <w:jc w:val="both"/>
+      </w:pPr>
+    </w:p>
+    <w:p>
+      <w:pPr>
+        <w:jc w:val="both"/>
+      </w:pPr>
+      <w:r>
+        <w:rPr>
+          <w:b/>
+          <w:bCs/>
+        </w:rPr>
+        <w:t>U</w:t>
+      </w:r>
+      <w:r>
+        <w:rPr>
+          <w:b/>
+          <w:bCs/>
+        </w:rPr>
+        <w:t>suarios</w:t>
+      </w:r>
+      <w:r>
+        <w:rPr>
+          <w:b/>
+          <w:bCs/>
+        </w:rPr>
+        <w:t xml:space="preserve"> </w:t>
+      </w:r>
+      <w:r>
+        <w:t>id, nombreUsuario, email, contraseña, fotoPerfil, fechaRegistro</w:t>
+      </w:r>
+      <w:r>
+        <w:t>, edad</w:t>
+      </w:r>
+    </w:p>
+    <w:p>
+      <w:pPr>
+        <w:jc w:val="both"/>
+      </w:pPr>
+    </w:p>
+    <w:p>
+      <w:pPr>
+        <w:jc w:val="both"/>
+      </w:pPr>
+      <w:r>
+        <w:rPr>
+          <w:b/>
+          <w:bCs/>
+        </w:rPr>
+        <w:t>R</w:t>
+      </w:r>
+      <w:r>
+        <w:rPr>
+          <w:b/>
+          <w:bCs/>
+        </w:rPr>
+        <w:t>utinas</w:t>
+      </w:r>
+      <w:r>
+        <w:rPr>
+          <w:b/>
+          <w:bCs/>
+        </w:rPr>
+        <w:t xml:space="preserve"> </w:t>
+      </w:r>
+      <w:r>
+        <w:t>id, nombre, descripcion, usuarioId</w:t>
+      </w:r>
+    </w:p>
+    <w:p>
+      <w:pPr>
+        <w:jc w:val="both"/>
+      </w:pPr>
+    </w:p>
+    <w:p>
+      <w:pPr>
+        <w:jc w:val="both"/>
+      </w:pPr>
+      <w:r>
+        <w:rPr>
+          <w:b/>
+          <w:bCs/>
+        </w:rPr>
+        <w:t>E</w:t>
+      </w:r>
+      <w:r>
+        <w:rPr>
+          <w:b/>
+          <w:bCs/>
+        </w:rPr>
+        <w:t>jercicios</w:t>
+      </w:r>
+      <w:r>
+        <w:rPr>
+          <w:b/>
+          <w:bCs/>
+        </w:rPr>
+        <w:t xml:space="preserve"> </w:t>
+      </w:r>
+      <w:r>
+        <w:t>id, nombre, descripcion, grupoMuscular, imagenUrl, videoUrl</w:t>
+      </w:r>
+    </w:p>
+    <w:p>
+      <w:pPr>
+        <w:jc w:val="both"/>
+      </w:pPr>
+    </w:p>
+    <w:p>
+      <w:pPr>
+        <w:jc w:val="both"/>
+      </w:pPr>
+      <w:r>
+        <w:rPr>
+          <w:b/>
+          <w:bCs/>
+        </w:rPr>
+        <w:t>rutina_ejercicio</w:t>
+      </w:r>
+      <w:r>
+        <w:rPr>
+          <w:b/>
+          <w:bCs/>
+        </w:rPr>
+        <w:t xml:space="preserve"> </w:t>
+      </w:r>
+      <w:r>
+        <w:t>id, rutinaId, ejercicioId, series, repeticiones, peso, descanso, orden</w:t>
+      </w:r>
+    </w:p>
+    <w:p>
+      <w:pPr>
+        <w:jc w:val="both"/>
+      </w:pPr>
+    </w:p>
+    <w:p>
+      <w:pPr>
+        <w:jc w:val="both"/>
+      </w:pPr>
+      <w:r>
+        <w:rPr>
+          <w:b/>
+          <w:bCs/>
+        </w:rPr>
+        <w:t>entrenamiento</w:t>
+      </w:r>
+      <w:r>
+        <w:rPr>
+          <w:b/>
+          <w:bCs/>
+        </w:rPr>
+        <w:t xml:space="preserve"> </w:t>
+      </w:r>
+      <w:r>
+        <w:rPr>
+          <w:b/>
+          <w:bCs/>
+        </w:rPr>
+        <w:t>s</w:t>
+      </w:r>
+      <w:r>
+        <w:t>id, usuarioId, rutinaId, fecha, duracion, volumenTotal</w:t>
+      </w:r>
+    </w:p>
+    <w:p>
+      <w:pPr>
+        <w:jc w:val="both"/>
+      </w:pPr>
+    </w:p>
+    <w:p>
+      <w:pPr>
+        <w:jc w:val="both"/>
+      </w:pPr>
+      <w:r>
+        <w:rPr>
+          <w:b/>
+          <w:bCs/>
+        </w:rPr>
+        <w:t>entrenamiento_ejercicio</w:t>
+      </w:r>
+      <w:r>
+        <w:t xml:space="preserve"> </w:t>
+      </w:r>
+      <w:r>
+        <w:t>id, entrenamientoId, ejercicioId, seriesRealizadas, repeticionesRealizadas, pesoUtilizado</w:t>
       </w:r>
     </w:p>
     <w:p>
@@ -1166,6 +1350,7 @@
       </w:pPr>
       <w:bookmarkStart w:id="7" w:name="_Toc243319666"/>
       <w:r>
+        <w:lastRenderedPageBreak/>
         <w:t>Video</w:t>
       </w:r>
       <w:bookmarkEnd w:id="7"/>

</xml_diff>